<commit_message>
correcoes e ajuste no relatorio
</commit_message>
<xml_diff>
--- a/RELATORIO.docx
+++ b/RELATORIO.docx
@@ -1552,50 +1552,188 @@
     </w:p>
     <w:p>
       <w:pPr>
-        <w:spacing w:after="120"/>
-      </w:pPr>
-      <w:r>
-        <w:t xml:space="preserve">&gt; Inicio do jogo em movimento</w:t>
-      </w:r>
-    </w:p>
-    <w:p>
-      <w:pPr>
-        <w:spacing w:after="120"/>
-      </w:pPr>
-      <w:r>
-        <w:t xml:space="preserve">![Inicio / Jogo em movimeto](images/SnakeGameMov.png)</w:t>
-      </w:r>
-    </w:p>
-    <w:p>
-      <w:pPr>
-        <w:spacing w:after="120"/>
-      </w:pPr>
-      <w:r>
-        <w:t xml:space="preserve">&gt; Menu do jogo</w:t>
-      </w:r>
-    </w:p>
-    <w:p>
-      <w:pPr>
-        <w:spacing w:after="120"/>
-      </w:pPr>
-      <w:r>
-        <w:t xml:space="preserve">![Menu do jogo](images/MenuSnake.png)</w:t>
-      </w:r>
-    </w:p>
-    <w:p>
-      <w:pPr>
-        <w:spacing w:after="120"/>
-      </w:pPr>
-      <w:r>
-        <w:t xml:space="preserve">&gt; Game over com pontuação total</w:t>
-      </w:r>
-    </w:p>
-    <w:p>
-      <w:pPr>
-        <w:spacing w:after="120"/>
-      </w:pPr>
-      <w:r>
-        <w:t xml:space="preserve">![Game over om pontuação total](images/GameOverSnake.png)</w:t>
+        <w:keepNext/>
+        <w:spacing w:before="200"/>
+        <w:jc w:val="center"/>
+      </w:pPr>
+      <w:r>
+        <w:drawing>
+          <wp:inline distT="0" distB="0" distL="0" distR="0">
+            <wp:extent cx="3048000" cy="3200400"/>
+            <wp:effectExtent t="0" r="0" b="0" l="0"/>
+            <wp:docPr id="1" name="SnakeGameMov.png" descr="Início / Jogo em movimento" title="Início / Jogo em movimento"/>
+            <wp:cNvGraphicFramePr>
+              <a:graphicFrameLocks xmlns:a="http://schemas.openxmlformats.org/drawingml/2006/main" noChangeAspect="1"/>
+            </wp:cNvGraphicFramePr>
+            <a:graphic xmlns:a="http://schemas.openxmlformats.org/drawingml/2006/main">
+              <a:graphicData uri="http://schemas.openxmlformats.org/drawingml/2006/picture">
+                <pic:pic xmlns:pic="http://schemas.openxmlformats.org/drawingml/2006/picture">
+                  <pic:nvPicPr>
+                    <pic:cNvPr id="0" name="" descr=""/>
+                    <pic:cNvPicPr>
+                      <a:picLocks noChangeAspect="1" noChangeArrowheads="1"/>
+                    </pic:cNvPicPr>
+                  </pic:nvPicPr>
+                  <pic:blipFill>
+                    <a:blip r:embed="rId7" cstate="none"/>
+                    <a:srcRect/>
+                    <a:stretch>
+                      <a:fillRect/>
+                    </a:stretch>
+                  </pic:blipFill>
+                  <pic:spPr bwMode="auto">
+                    <a:xfrm>
+                      <a:off x="0" y="0"/>
+                      <a:ext cx="3048000" cy="3200400"/>
+                    </a:xfrm>
+                    <a:prstGeom prst="rect">
+                      <a:avLst/>
+                    </a:prstGeom>
+                  </pic:spPr>
+                </pic:pic>
+              </a:graphicData>
+            </a:graphic>
+          </wp:inline>
+        </w:drawing>
+      </w:r>
+    </w:p>
+    <w:p>
+      <w:pPr>
+        <w:spacing w:after="200"/>
+        <w:jc w:val="center"/>
+      </w:pPr>
+      <w:r>
+        <w:rPr>
+          <w:i/>
+          <w:iCs/>
+          <w:sz w:val="20"/>
+          <w:szCs w:val="20"/>
+        </w:rPr>
+        <w:t xml:space="preserve">Início / Jogo em movimento</w:t>
+      </w:r>
+    </w:p>
+    <w:p>
+      <w:pPr>
+        <w:keepNext/>
+        <w:spacing w:before="200"/>
+        <w:jc w:val="center"/>
+      </w:pPr>
+      <w:r>
+        <w:drawing>
+          <wp:inline distT="0" distB="0" distL="0" distR="0">
+            <wp:extent cx="3048000" cy="3133725"/>
+            <wp:effectExtent t="0" r="0" b="0" l="0"/>
+            <wp:docPr id="2" name="MenuSnake.png" descr="Menu do jogo" title="Menu do jogo"/>
+            <wp:cNvGraphicFramePr>
+              <a:graphicFrameLocks xmlns:a="http://schemas.openxmlformats.org/drawingml/2006/main" noChangeAspect="1"/>
+            </wp:cNvGraphicFramePr>
+            <a:graphic xmlns:a="http://schemas.openxmlformats.org/drawingml/2006/main">
+              <a:graphicData uri="http://schemas.openxmlformats.org/drawingml/2006/picture">
+                <pic:pic xmlns:pic="http://schemas.openxmlformats.org/drawingml/2006/picture">
+                  <pic:nvPicPr>
+                    <pic:cNvPr id="0" name="" descr=""/>
+                    <pic:cNvPicPr>
+                      <a:picLocks noChangeAspect="1" noChangeArrowheads="1"/>
+                    </pic:cNvPicPr>
+                  </pic:nvPicPr>
+                  <pic:blipFill>
+                    <a:blip r:embed="rId8" cstate="none"/>
+                    <a:srcRect/>
+                    <a:stretch>
+                      <a:fillRect/>
+                    </a:stretch>
+                  </pic:blipFill>
+                  <pic:spPr bwMode="auto">
+                    <a:xfrm>
+                      <a:off x="0" y="0"/>
+                      <a:ext cx="3048000" cy="3133725"/>
+                    </a:xfrm>
+                    <a:prstGeom prst="rect">
+                      <a:avLst/>
+                    </a:prstGeom>
+                  </pic:spPr>
+                </pic:pic>
+              </a:graphicData>
+            </a:graphic>
+          </wp:inline>
+        </w:drawing>
+      </w:r>
+    </w:p>
+    <w:p>
+      <w:pPr>
+        <w:spacing w:after="200"/>
+        <w:jc w:val="center"/>
+      </w:pPr>
+      <w:r>
+        <w:rPr>
+          <w:i/>
+          <w:iCs/>
+          <w:sz w:val="20"/>
+          <w:szCs w:val="20"/>
+        </w:rPr>
+        <w:t xml:space="preserve">Menu do jogo</w:t>
+      </w:r>
+    </w:p>
+    <w:p>
+      <w:pPr>
+        <w:keepNext/>
+        <w:spacing w:before="200"/>
+        <w:jc w:val="center"/>
+      </w:pPr>
+      <w:r>
+        <w:drawing>
+          <wp:inline distT="0" distB="0" distL="0" distR="0">
+            <wp:extent cx="3048000" cy="3019425"/>
+            <wp:effectExtent t="0" r="0" b="0" l="0"/>
+            <wp:docPr id="3" name="GameOverSnake.png" descr="Game over com pontuação total" title="Game over com pontuação total"/>
+            <wp:cNvGraphicFramePr>
+              <a:graphicFrameLocks xmlns:a="http://schemas.openxmlformats.org/drawingml/2006/main" noChangeAspect="1"/>
+            </wp:cNvGraphicFramePr>
+            <a:graphic xmlns:a="http://schemas.openxmlformats.org/drawingml/2006/main">
+              <a:graphicData uri="http://schemas.openxmlformats.org/drawingml/2006/picture">
+                <pic:pic xmlns:pic="http://schemas.openxmlformats.org/drawingml/2006/picture">
+                  <pic:nvPicPr>
+                    <pic:cNvPr id="0" name="" descr=""/>
+                    <pic:cNvPicPr>
+                      <a:picLocks noChangeAspect="1" noChangeArrowheads="1"/>
+                    </pic:cNvPicPr>
+                  </pic:nvPicPr>
+                  <pic:blipFill>
+                    <a:blip r:embed="rId9" cstate="none"/>
+                    <a:srcRect/>
+                    <a:stretch>
+                      <a:fillRect/>
+                    </a:stretch>
+                  </pic:blipFill>
+                  <pic:spPr bwMode="auto">
+                    <a:xfrm>
+                      <a:off x="0" y="0"/>
+                      <a:ext cx="3048000" cy="3019425"/>
+                    </a:xfrm>
+                    <a:prstGeom prst="rect">
+                      <a:avLst/>
+                    </a:prstGeom>
+                  </pic:spPr>
+                </pic:pic>
+              </a:graphicData>
+            </a:graphic>
+          </wp:inline>
+        </w:drawing>
+      </w:r>
+    </w:p>
+    <w:p>
+      <w:pPr>
+        <w:spacing w:after="200"/>
+        <w:jc w:val="center"/>
+      </w:pPr>
+      <w:r>
+        <w:rPr>
+          <w:i/>
+          <w:iCs/>
+          <w:sz w:val="20"/>
+          <w:szCs w:val="20"/>
+        </w:rPr>
+        <w:t xml:space="preserve">Game over com pontuação total</w:t>
       </w:r>
     </w:p>
     <w:p>

</xml_diff>